<commit_message>
centinela.cmd: correcciones para Windows de la revision e informe regenerado
- Velocidad con coma decimal ("-Velocidad 0,5" se leia como 5) y validacion de rango.
- Si se cambia un puerto, avisa que hay que abrirlo en el firewall de esta PC.
- "configurar -Si" respeta WORKERS del .env; un .env con la llave HMAC de ejemplo (creado por
  "compilar") ya no se toma como el .env de la primera PC.
- exportar-imagenes funciona en una PC recien clonada; *.tar fuera de git y del contexto de Docker.
- respaldo, restaurar, caida, recuperar y detener ya no informan exito si docker compose falla.
- dlq sin alert-service: el titulo dice que son los primeros 20 mensajes.
- Informe y anexo de ADRs regenerados con la documentacion corregida.

Co-Authored-By: Claude Opus 5.5 <noreply@anthropic.com>
Claude-Session: https://claude.ai/code/session_01SKDRaqP2Mxb64nZs4eFdyh
</commit_message>
<xml_diff>
--- a/informe/Anexo-A-ADRs.docx
+++ b/informe/Anexo-A-ADRs.docx
@@ -1491,7 +1491,7 @@
             <w:tab/>
           </w:r>
           <w:r>
-            <w:t>39</w:t>
+            <w:t>40</w:t>
           </w:r>
         </w:p>
         <w:p>
@@ -14147,9 +14147,9 @@
         </w:tblBorders>
       </w:tblPr>
       <w:tblGrid>
-        <w:gridCol w:w="2904"/>
-        <w:gridCol w:w="2155"/>
-        <w:gridCol w:w="4301"/>
+        <w:gridCol w:w="3011"/>
+        <w:gridCol w:w="1694"/>
+        <w:gridCol w:w="4655"/>
       </w:tblGrid>
       <w:tr>
         <w:trPr>
@@ -14157,7 +14157,7 @@
         </w:trPr>
         <w:tc>
           <w:tcPr>
-            <w:tcW w:type="dxa" w:w="2904"/>
+            <w:tcW w:type="dxa" w:w="3011"/>
             <w:tcBorders>
               <w:top w:val="single" w:color="000000" w:sz="8"/>
               <w:left w:val="none" w:color="FFFFFF" w:sz="0"/>
@@ -14190,7 +14190,7 @@
         </w:tc>
         <w:tc>
           <w:tcPr>
-            <w:tcW w:type="dxa" w:w="2155"/>
+            <w:tcW w:type="dxa" w:w="1694"/>
             <w:tcBorders>
               <w:top w:val="single" w:color="000000" w:sz="8"/>
               <w:left w:val="none" w:color="FFFFFF" w:sz="0"/>
@@ -14223,7 +14223,7 @@
         </w:tc>
         <w:tc>
           <w:tcPr>
-            <w:tcW w:type="dxa" w:w="4301"/>
+            <w:tcW w:type="dxa" w:w="4655"/>
             <w:tcBorders>
               <w:top w:val="single" w:color="000000" w:sz="8"/>
               <w:left w:val="none" w:color="FFFFFF" w:sz="0"/>
@@ -14261,7 +14261,7 @@
         </w:trPr>
         <w:tc>
           <w:tcPr>
-            <w:tcW w:type="dxa" w:w="2904"/>
+            <w:tcW w:type="dxa" w:w="3011"/>
             <w:tcBorders>
               <w:top w:val="none" w:color="FFFFFF" w:sz="0"/>
               <w:left w:val="none" w:color="FFFFFF" w:sz="0"/>
@@ -14294,7 +14294,7 @@
         </w:tc>
         <w:tc>
           <w:tcPr>
-            <w:tcW w:type="dxa" w:w="2155"/>
+            <w:tcW w:type="dxa" w:w="1694"/>
             <w:tcBorders>
               <w:top w:val="none" w:color="FFFFFF" w:sz="0"/>
               <w:left w:val="none" w:color="FFFFFF" w:sz="0"/>
@@ -14327,7 +14327,7 @@
         </w:tc>
         <w:tc>
           <w:tcPr>
-            <w:tcW w:type="dxa" w:w="4301"/>
+            <w:tcW w:type="dxa" w:w="4655"/>
             <w:tcBorders>
               <w:top w:val="none" w:color="FFFFFF" w:sz="0"/>
               <w:left w:val="none" w:color="FFFFFF" w:sz="0"/>
@@ -14365,7 +14365,7 @@
         </w:trPr>
         <w:tc>
           <w:tcPr>
-            <w:tcW w:type="dxa" w:w="2904"/>
+            <w:tcW w:type="dxa" w:w="3011"/>
             <w:tcBorders>
               <w:top w:val="none" w:color="FFFFFF" w:sz="0"/>
               <w:left w:val="none" w:color="FFFFFF" w:sz="0"/>
@@ -14398,7 +14398,7 @@
         </w:tc>
         <w:tc>
           <w:tcPr>
-            <w:tcW w:type="dxa" w:w="2155"/>
+            <w:tcW w:type="dxa" w:w="1694"/>
             <w:tcBorders>
               <w:top w:val="none" w:color="FFFFFF" w:sz="0"/>
               <w:left w:val="none" w:color="FFFFFF" w:sz="0"/>
@@ -14431,7 +14431,7 @@
         </w:tc>
         <w:tc>
           <w:tcPr>
-            <w:tcW w:type="dxa" w:w="4301"/>
+            <w:tcW w:type="dxa" w:w="4655"/>
             <w:tcBorders>
               <w:top w:val="none" w:color="FFFFFF" w:sz="0"/>
               <w:left w:val="none" w:color="FFFFFF" w:sz="0"/>
@@ -14469,7 +14469,7 @@
         </w:trPr>
         <w:tc>
           <w:tcPr>
-            <w:tcW w:type="dxa" w:w="2904"/>
+            <w:tcW w:type="dxa" w:w="3011"/>
             <w:tcBorders>
               <w:top w:val="none" w:color="FFFFFF" w:sz="0"/>
               <w:left w:val="none" w:color="FFFFFF" w:sz="0"/>
@@ -14502,7 +14502,7 @@
         </w:tc>
         <w:tc>
           <w:tcPr>
-            <w:tcW w:type="dxa" w:w="2155"/>
+            <w:tcW w:type="dxa" w:w="1694"/>
             <w:tcBorders>
               <w:top w:val="none" w:color="FFFFFF" w:sz="0"/>
               <w:left w:val="none" w:color="FFFFFF" w:sz="0"/>
@@ -14535,7 +14535,7 @@
         </w:tc>
         <w:tc>
           <w:tcPr>
-            <w:tcW w:type="dxa" w:w="4301"/>
+            <w:tcW w:type="dxa" w:w="4655"/>
             <w:tcBorders>
               <w:top w:val="none" w:color="FFFFFF" w:sz="0"/>
               <w:left w:val="none" w:color="FFFFFF" w:sz="0"/>
@@ -14573,7 +14573,7 @@
         </w:trPr>
         <w:tc>
           <w:tcPr>
-            <w:tcW w:type="dxa" w:w="2904"/>
+            <w:tcW w:type="dxa" w:w="3011"/>
             <w:tcBorders>
               <w:top w:val="none" w:color="FFFFFF" w:sz="0"/>
               <w:left w:val="none" w:color="FFFFFF" w:sz="0"/>
@@ -14606,7 +14606,7 @@
         </w:tc>
         <w:tc>
           <w:tcPr>
-            <w:tcW w:type="dxa" w:w="2155"/>
+            <w:tcW w:type="dxa" w:w="1694"/>
             <w:tcBorders>
               <w:top w:val="none" w:color="FFFFFF" w:sz="0"/>
               <w:left w:val="none" w:color="FFFFFF" w:sz="0"/>
@@ -14639,7 +14639,7 @@
         </w:tc>
         <w:tc>
           <w:tcPr>
-            <w:tcW w:type="dxa" w:w="4301"/>
+            <w:tcW w:type="dxa" w:w="4655"/>
             <w:tcBorders>
               <w:top w:val="none" w:color="FFFFFF" w:sz="0"/>
               <w:left w:val="none" w:color="FFFFFF" w:sz="0"/>
@@ -14677,7 +14677,215 @@
         </w:trPr>
         <w:tc>
           <w:tcPr>
-            <w:tcW w:type="dxa" w:w="2904"/>
+            <w:tcW w:type="dxa" w:w="3011"/>
+            <w:tcBorders>
+              <w:top w:val="none" w:color="FFFFFF" w:sz="0"/>
+              <w:left w:val="none" w:color="FFFFFF" w:sz="0"/>
+              <w:bottom w:val="none" w:color="FFFFFF" w:sz="0"/>
+              <w:right w:val="none" w:color="FFFFFF" w:sz="0"/>
+            </w:tcBorders>
+            <w:tcMar>
+              <w:top w:type="dxa" w:w="60"/>
+              <w:left w:type="dxa" w:w="80"/>
+              <w:bottom w:type="dxa" w:w="60"/>
+              <w:right w:type="dxa" w:w="80"/>
+            </w:tcMar>
+            <w:vAlign w:val="top"/>
+          </w:tcPr>
+          <w:p>
+            <w:pPr>
+              <w:keepNext w:val="false"/>
+              <w:spacing w:after="0" w:line="240" w:lineRule="auto"/>
+            </w:pPr>
+            <w:r>
+              <w:rPr>
+                <w:b w:val="false"/>
+                <w:bCs w:val="false"/>
+                <w:sz w:val="20"/>
+                <w:szCs w:val="20"/>
+              </w:rPr>
+              <w:t xml:space="preserve">Sincronización de la lista de placas</w:t>
+            </w:r>
+          </w:p>
+        </w:tc>
+        <w:tc>
+          <w:tcPr>
+            <w:tcW w:type="dxa" w:w="1694"/>
+            <w:tcBorders>
+              <w:top w:val="none" w:color="FFFFFF" w:sz="0"/>
+              <w:left w:val="none" w:color="FFFFFF" w:sz="0"/>
+              <w:bottom w:val="none" w:color="FFFFFF" w:sz="0"/>
+              <w:right w:val="none" w:color="FFFFFF" w:sz="0"/>
+            </w:tcBorders>
+            <w:tcMar>
+              <w:top w:type="dxa" w:w="60"/>
+              <w:left w:type="dxa" w:w="80"/>
+              <w:bottom w:type="dxa" w:w="60"/>
+              <w:right w:type="dxa" w:w="80"/>
+            </w:tcMar>
+            <w:vAlign w:val="top"/>
+          </w:tcPr>
+          <w:p>
+            <w:pPr>
+              <w:keepNext w:val="false"/>
+              <w:spacing w:after="0" w:line="240" w:lineRule="auto"/>
+            </w:pPr>
+            <w:r>
+              <w:rPr>
+                <w:b w:val="false"/>
+                <w:bCs w:val="false"/>
+                <w:sz w:val="20"/>
+                <w:szCs w:val="20"/>
+              </w:rPr>
+              <w:t xml:space="preserve">Cada 10 min</w:t>
+            </w:r>
+          </w:p>
+        </w:tc>
+        <w:tc>
+          <w:tcPr>
+            <w:tcW w:type="dxa" w:w="4655"/>
+            <w:tcBorders>
+              <w:top w:val="none" w:color="FFFFFF" w:sz="0"/>
+              <w:left w:val="none" w:color="FFFFFF" w:sz="0"/>
+              <w:bottom w:val="none" w:color="FFFFFF" w:sz="0"/>
+              <w:right w:val="none" w:color="FFFFFF" w:sz="0"/>
+            </w:tcBorders>
+            <w:tcMar>
+              <w:top w:type="dxa" w:w="60"/>
+              <w:left w:type="dxa" w:w="80"/>
+              <w:bottom w:type="dxa" w:w="60"/>
+              <w:right w:type="dxa" w:w="80"/>
+            </w:tcMar>
+            <w:vAlign w:val="top"/>
+          </w:tcPr>
+          <w:p>
+            <w:pPr>
+              <w:keepNext w:val="false"/>
+              <w:spacing w:after="0" w:line="240" w:lineRule="auto"/>
+            </w:pPr>
+            <w:r>
+              <w:rPr>
+                <w:b w:val="false"/>
+                <w:bCs w:val="false"/>
+                <w:sz w:val="20"/>
+                <w:szCs w:val="20"/>
+              </w:rPr>
+              <w:t xml:space="preserve">Copia los seudónimos de PostgreSQL a Redis</w:t>
+            </w:r>
+          </w:p>
+        </w:tc>
+      </w:tr>
+      <w:tr>
+        <w:trPr>
+          <w:tblHeader w:val="false"/>
+        </w:trPr>
+        <w:tc>
+          <w:tcPr>
+            <w:tcW w:type="dxa" w:w="3011"/>
+            <w:tcBorders>
+              <w:top w:val="none" w:color="FFFFFF" w:sz="0"/>
+              <w:left w:val="none" w:color="FFFFFF" w:sz="0"/>
+              <w:bottom w:val="none" w:color="FFFFFF" w:sz="0"/>
+              <w:right w:val="none" w:color="FFFFFF" w:sz="0"/>
+            </w:tcBorders>
+            <w:tcMar>
+              <w:top w:type="dxa" w:w="60"/>
+              <w:left w:type="dxa" w:w="80"/>
+              <w:bottom w:type="dxa" w:w="60"/>
+              <w:right w:type="dxa" w:w="80"/>
+            </w:tcMar>
+            <w:vAlign w:val="top"/>
+          </w:tcPr>
+          <w:p>
+            <w:pPr>
+              <w:keepNext w:val="false"/>
+              <w:spacing w:after="0" w:line="240" w:lineRule="auto"/>
+            </w:pPr>
+            <w:r>
+              <w:rPr>
+                <w:b w:val="false"/>
+                <w:bCs w:val="false"/>
+                <w:sz w:val="20"/>
+                <w:szCs w:val="20"/>
+              </w:rPr>
+              <w:t xml:space="preserve">Revisión de la lista de placas</w:t>
+            </w:r>
+          </w:p>
+        </w:tc>
+        <w:tc>
+          <w:tcPr>
+            <w:tcW w:type="dxa" w:w="1694"/>
+            <w:tcBorders>
+              <w:top w:val="none" w:color="FFFFFF" w:sz="0"/>
+              <w:left w:val="none" w:color="FFFFFF" w:sz="0"/>
+              <w:bottom w:val="none" w:color="FFFFFF" w:sz="0"/>
+              <w:right w:val="none" w:color="FFFFFF" w:sz="0"/>
+            </w:tcBorders>
+            <w:tcMar>
+              <w:top w:type="dxa" w:w="60"/>
+              <w:left w:type="dxa" w:w="80"/>
+              <w:bottom w:type="dxa" w:w="60"/>
+              <w:right w:type="dxa" w:w="80"/>
+            </w:tcMar>
+            <w:vAlign w:val="top"/>
+          </w:tcPr>
+          <w:p>
+            <w:pPr>
+              <w:keepNext w:val="false"/>
+              <w:spacing w:after="0" w:line="240" w:lineRule="auto"/>
+            </w:pPr>
+            <w:r>
+              <w:rPr>
+                <w:b w:val="false"/>
+                <w:bCs w:val="false"/>
+                <w:sz w:val="20"/>
+                <w:szCs w:val="20"/>
+              </w:rPr>
+              <w:t xml:space="preserve">Cada 15 s</w:t>
+            </w:r>
+          </w:p>
+        </w:tc>
+        <w:tc>
+          <w:tcPr>
+            <w:tcW w:type="dxa" w:w="4655"/>
+            <w:tcBorders>
+              <w:top w:val="none" w:color="FFFFFF" w:sz="0"/>
+              <w:left w:val="none" w:color="FFFFFF" w:sz="0"/>
+              <w:bottom w:val="none" w:color="FFFFFF" w:sz="0"/>
+              <w:right w:val="none" w:color="FFFFFF" w:sz="0"/>
+            </w:tcBorders>
+            <w:tcMar>
+              <w:top w:type="dxa" w:w="60"/>
+              <w:left w:type="dxa" w:w="80"/>
+              <w:bottom w:type="dxa" w:w="60"/>
+              <w:right w:type="dxa" w:w="80"/>
+            </w:tcMar>
+            <w:vAlign w:val="top"/>
+          </w:tcPr>
+          <w:p>
+            <w:pPr>
+              <w:keepNext w:val="false"/>
+              <w:spacing w:after="0" w:line="240" w:lineRule="auto"/>
+            </w:pPr>
+            <w:r>
+              <w:rPr>
+                <w:b w:val="false"/>
+                <w:bCs w:val="false"/>
+                <w:sz w:val="20"/>
+                <w:szCs w:val="20"/>
+              </w:rPr>
+              <w:t xml:space="preserve">Si Redis se reinició vacío, recarga la lista de inmediato (ADR-006)</w:t>
+            </w:r>
+          </w:p>
+        </w:tc>
+      </w:tr>
+      <w:tr>
+        <w:trPr>
+          <w:tblHeader w:val="false"/>
+        </w:trPr>
+        <w:tc>
+          <w:tcPr>
+            <w:tcW w:type="dxa" w:w="3011"/>
             <w:tcBorders>
               <w:top w:val="none" w:color="FFFFFF" w:sz="0"/>
               <w:left w:val="none" w:color="FFFFFF" w:sz="0"/>
@@ -14704,13 +14912,13 @@
                 <w:sz w:val="20"/>
                 <w:szCs w:val="20"/>
               </w:rPr>
-              <w:t xml:space="preserve">Sincronización de la lista de placas</w:t>
-            </w:r>
-          </w:p>
-        </w:tc>
-        <w:tc>
-          <w:tcPr>
-            <w:tcW w:type="dxa" w:w="2155"/>
+              <w:t xml:space="preserve">Reproceso de la DLQ</w:t>
+            </w:r>
+          </w:p>
+        </w:tc>
+        <w:tc>
+          <w:tcPr>
+            <w:tcW w:type="dxa" w:w="1694"/>
             <w:tcBorders>
               <w:top w:val="none" w:color="FFFFFF" w:sz="0"/>
               <w:left w:val="none" w:color="FFFFFF" w:sz="0"/>
@@ -14737,13 +14945,13 @@
                 <w:sz w:val="20"/>
                 <w:szCs w:val="20"/>
               </w:rPr>
-              <w:t xml:space="preserve">Cada 10 min y al iniciar</w:t>
-            </w:r>
-          </w:p>
-        </w:tc>
-        <w:tc>
-          <w:tcPr>
-            <w:tcW w:type="dxa" w:w="4301"/>
+              <w:t xml:space="preserve">Cada 5 min</w:t>
+            </w:r>
+          </w:p>
+        </w:tc>
+        <w:tc>
+          <w:tcPr>
+            <w:tcW w:type="dxa" w:w="4655"/>
             <w:tcBorders>
               <w:top w:val="none" w:color="FFFFFF" w:sz="0"/>
               <w:left w:val="none" w:color="FFFFFF" w:sz="0"/>
@@ -14770,7 +14978,7 @@
                 <w:sz w:val="20"/>
                 <w:szCs w:val="20"/>
               </w:rPr>
-              <w:t xml:space="preserve">Copia los seudónimos de PostgreSQL a Redis</w:t>
+              <w:t xml:space="preserve">Reinyecta lo que falló por causas no permanentes, hasta 3 veces (ADR-006)</w:t>
             </w:r>
           </w:p>
         </w:tc>
@@ -14795,7 +15003,7 @@
           <w:b/>
           <w:bCs/>
         </w:rPr>
-        <w:t xml:space="preserve">5 tareas independientes, cortas (de milisegundos a segundos) y sin dependencias entre sí</w:t>
+        <w:t xml:space="preserve">7 tareas independientes, cortas (de milisegundos a segundos) y sin dependencias entre sí</w:t>
       </w:r>
       <w:r>
         <w:t xml:space="preserve">. No hay flujos de varios pasos, reintentos encadenados ni reprocesos de fechas pasadas (</w:t>
@@ -19723,10 +19931,10 @@
         </w:tblBorders>
       </w:tblPr>
       <w:tblGrid>
-        <w:gridCol w:w="2109"/>
-        <w:gridCol w:w="2259"/>
-        <w:gridCol w:w="2589"/>
-        <w:gridCol w:w="2403"/>
+        <w:gridCol w:w="2097"/>
+        <w:gridCol w:w="2239"/>
+        <w:gridCol w:w="2667"/>
+        <w:gridCol w:w="2357"/>
       </w:tblGrid>
       <w:tr>
         <w:trPr>
@@ -19734,7 +19942,7 @@
         </w:trPr>
         <w:tc>
           <w:tcPr>
-            <w:tcW w:type="dxa" w:w="2109"/>
+            <w:tcW w:type="dxa" w:w="2097"/>
             <w:tcBorders>
               <w:top w:val="single" w:color="000000" w:sz="8"/>
               <w:left w:val="none" w:color="FFFFFF" w:sz="0"/>
@@ -19767,7 +19975,7 @@
         </w:tc>
         <w:tc>
           <w:tcPr>
-            <w:tcW w:type="dxa" w:w="2259"/>
+            <w:tcW w:type="dxa" w:w="2239"/>
             <w:tcBorders>
               <w:top w:val="single" w:color="000000" w:sz="8"/>
               <w:left w:val="none" w:color="FFFFFF" w:sz="0"/>
@@ -19800,7 +20008,7 @@
         </w:tc>
         <w:tc>
           <w:tcPr>
-            <w:tcW w:type="dxa" w:w="2589"/>
+            <w:tcW w:type="dxa" w:w="2667"/>
             <w:tcBorders>
               <w:top w:val="single" w:color="000000" w:sz="8"/>
               <w:left w:val="none" w:color="FFFFFF" w:sz="0"/>
@@ -19833,7 +20041,7 @@
         </w:tc>
         <w:tc>
           <w:tcPr>
-            <w:tcW w:type="dxa" w:w="2403"/>
+            <w:tcW w:type="dxa" w:w="2357"/>
             <w:tcBorders>
               <w:top w:val="single" w:color="000000" w:sz="8"/>
               <w:left w:val="none" w:color="FFFFFF" w:sz="0"/>
@@ -19871,7 +20079,7 @@
         </w:trPr>
         <w:tc>
           <w:tcPr>
-            <w:tcW w:type="dxa" w:w="2109"/>
+            <w:tcW w:type="dxa" w:w="2097"/>
             <w:tcBorders>
               <w:top w:val="none" w:color="FFFFFF" w:sz="0"/>
               <w:left w:val="none" w:color="FFFFFF" w:sz="0"/>
@@ -19904,7 +20112,7 @@
         </w:tc>
         <w:tc>
           <w:tcPr>
-            <w:tcW w:type="dxa" w:w="2259"/>
+            <w:tcW w:type="dxa" w:w="2239"/>
             <w:tcBorders>
               <w:top w:val="none" w:color="FFFFFF" w:sz="0"/>
               <w:left w:val="none" w:color="FFFFFF" w:sz="0"/>
@@ -19937,7 +20145,7 @@
         </w:tc>
         <w:tc>
           <w:tcPr>
-            <w:tcW w:type="dxa" w:w="2589"/>
+            <w:tcW w:type="dxa" w:w="2667"/>
             <w:tcBorders>
               <w:top w:val="none" w:color="FFFFFF" w:sz="0"/>
               <w:left w:val="none" w:color="FFFFFF" w:sz="0"/>
@@ -19988,7 +20196,7 @@
         </w:tc>
         <w:tc>
           <w:tcPr>
-            <w:tcW w:type="dxa" w:w="2403"/>
+            <w:tcW w:type="dxa" w:w="2357"/>
             <w:tcBorders>
               <w:top w:val="none" w:color="FFFFFF" w:sz="0"/>
               <w:left w:val="none" w:color="FFFFFF" w:sz="0"/>
@@ -20035,7 +20243,7 @@
         </w:trPr>
         <w:tc>
           <w:tcPr>
-            <w:tcW w:type="dxa" w:w="2109"/>
+            <w:tcW w:type="dxa" w:w="2097"/>
             <w:tcBorders>
               <w:top w:val="none" w:color="FFFFFF" w:sz="0"/>
               <w:left w:val="none" w:color="FFFFFF" w:sz="0"/>
@@ -20068,7 +20276,7 @@
         </w:tc>
         <w:tc>
           <w:tcPr>
-            <w:tcW w:type="dxa" w:w="2259"/>
+            <w:tcW w:type="dxa" w:w="2239"/>
             <w:tcBorders>
               <w:top w:val="none" w:color="FFFFFF" w:sz="0"/>
               <w:left w:val="none" w:color="FFFFFF" w:sz="0"/>
@@ -20101,7 +20309,7 @@
         </w:tc>
         <w:tc>
           <w:tcPr>
-            <w:tcW w:type="dxa" w:w="2589"/>
+            <w:tcW w:type="dxa" w:w="2667"/>
             <w:tcBorders>
               <w:top w:val="none" w:color="FFFFFF" w:sz="0"/>
               <w:left w:val="none" w:color="FFFFFF" w:sz="0"/>
@@ -20143,7 +20351,7 @@
         </w:tc>
         <w:tc>
           <w:tcPr>
-            <w:tcW w:type="dxa" w:w="2403"/>
+            <w:tcW w:type="dxa" w:w="2357"/>
             <w:tcBorders>
               <w:top w:val="none" w:color="FFFFFF" w:sz="0"/>
               <w:left w:val="none" w:color="FFFFFF" w:sz="0"/>
@@ -20190,7 +20398,7 @@
         </w:trPr>
         <w:tc>
           <w:tcPr>
-            <w:tcW w:type="dxa" w:w="2109"/>
+            <w:tcW w:type="dxa" w:w="2097"/>
             <w:tcBorders>
               <w:top w:val="none" w:color="FFFFFF" w:sz="0"/>
               <w:left w:val="none" w:color="FFFFFF" w:sz="0"/>
@@ -20223,7 +20431,7 @@
         </w:tc>
         <w:tc>
           <w:tcPr>
-            <w:tcW w:type="dxa" w:w="2259"/>
+            <w:tcW w:type="dxa" w:w="2239"/>
             <w:tcBorders>
               <w:top w:val="none" w:color="FFFFFF" w:sz="0"/>
               <w:left w:val="none" w:color="FFFFFF" w:sz="0"/>
@@ -20256,7 +20464,7 @@
         </w:tc>
         <w:tc>
           <w:tcPr>
-            <w:tcW w:type="dxa" w:w="2589"/>
+            <w:tcW w:type="dxa" w:w="2667"/>
             <w:tcBorders>
               <w:top w:val="none" w:color="FFFFFF" w:sz="0"/>
               <w:left w:val="none" w:color="FFFFFF" w:sz="0"/>
@@ -20329,7 +20537,7 @@
         </w:tc>
         <w:tc>
           <w:tcPr>
-            <w:tcW w:type="dxa" w:w="2403"/>
+            <w:tcW w:type="dxa" w:w="2357"/>
             <w:tcBorders>
               <w:top w:val="none" w:color="FFFFFF" w:sz="0"/>
               <w:left w:val="none" w:color="FFFFFF" w:sz="0"/>
@@ -20376,7 +20584,7 @@
         </w:trPr>
         <w:tc>
           <w:tcPr>
-            <w:tcW w:type="dxa" w:w="2109"/>
+            <w:tcW w:type="dxa" w:w="2097"/>
             <w:tcBorders>
               <w:top w:val="none" w:color="FFFFFF" w:sz="0"/>
               <w:left w:val="none" w:color="FFFFFF" w:sz="0"/>
@@ -20409,7 +20617,7 @@
         </w:tc>
         <w:tc>
           <w:tcPr>
-            <w:tcW w:type="dxa" w:w="2259"/>
+            <w:tcW w:type="dxa" w:w="2239"/>
             <w:tcBorders>
               <w:top w:val="none" w:color="FFFFFF" w:sz="0"/>
               <w:left w:val="none" w:color="FFFFFF" w:sz="0"/>
@@ -20442,40 +20650,40 @@
         </w:tc>
         <w:tc>
           <w:tcPr>
-            <w:tcW w:type="dxa" w:w="2589"/>
-            <w:tcBorders>
-              <w:top w:val="none" w:color="FFFFFF" w:sz="0"/>
-              <w:left w:val="none" w:color="FFFFFF" w:sz="0"/>
-              <w:bottom w:val="none" w:color="FFFFFF" w:sz="0"/>
-              <w:right w:val="none" w:color="FFFFFF" w:sz="0"/>
-            </w:tcBorders>
-            <w:tcMar>
-              <w:top w:type="dxa" w:w="60"/>
-              <w:left w:type="dxa" w:w="80"/>
-              <w:bottom w:type="dxa" w:w="60"/>
-              <w:right w:type="dxa" w:w="80"/>
-            </w:tcMar>
-            <w:vAlign w:val="top"/>
-          </w:tcPr>
-          <w:p>
-            <w:pPr>
-              <w:keepNext w:val="false"/>
-              <w:spacing w:after="0" w:line="240" w:lineRule="auto"/>
-            </w:pPr>
-            <w:r>
-              <w:rPr>
-                <w:b w:val="false"/>
-                <w:bCs w:val="false"/>
-                <w:sz w:val="20"/>
-                <w:szCs w:val="20"/>
-              </w:rPr>
-              <w:t xml:space="preserve">Críticos sin tope + telemetría útil con tope</w:t>
-            </w:r>
-          </w:p>
-        </w:tc>
-        <w:tc>
-          <w:tcPr>
-            <w:tcW w:type="dxa" w:w="2403"/>
+            <w:tcW w:type="dxa" w:w="2667"/>
+            <w:tcBorders>
+              <w:top w:val="none" w:color="FFFFFF" w:sz="0"/>
+              <w:left w:val="none" w:color="FFFFFF" w:sz="0"/>
+              <w:bottom w:val="none" w:color="FFFFFF" w:sz="0"/>
+              <w:right w:val="none" w:color="FFFFFF" w:sz="0"/>
+            </w:tcBorders>
+            <w:tcMar>
+              <w:top w:type="dxa" w:w="60"/>
+              <w:left w:type="dxa" w:w="80"/>
+              <w:bottom w:type="dxa" w:w="60"/>
+              <w:right w:type="dxa" w:w="80"/>
+            </w:tcMar>
+            <w:vAlign w:val="top"/>
+          </w:tcPr>
+          <w:p>
+            <w:pPr>
+              <w:keepNext w:val="false"/>
+              <w:spacing w:after="0" w:line="240" w:lineRule="auto"/>
+            </w:pPr>
+            <w:r>
+              <w:rPr>
+                <w:b w:val="false"/>
+                <w:bCs w:val="false"/>
+                <w:sz w:val="20"/>
+                <w:szCs w:val="20"/>
+              </w:rPr>
+              <w:t xml:space="preserve">Críticos sin vencimiento (tope 32 MB) + telemetría útil con tope de 15 min</w:t>
+            </w:r>
+          </w:p>
+        </w:tc>
+        <w:tc>
+          <w:tcPr>
+            <w:tcW w:type="dxa" w:w="2357"/>
             <w:tcBorders>
               <w:top w:val="none" w:color="FFFFFF" w:sz="0"/>
               <w:left w:val="none" w:color="FFFFFF" w:sz="0"/>
@@ -20522,7 +20730,7 @@
         </w:trPr>
         <w:tc>
           <w:tcPr>
-            <w:tcW w:type="dxa" w:w="2109"/>
+            <w:tcW w:type="dxa" w:w="2097"/>
             <w:tcBorders>
               <w:top w:val="none" w:color="FFFFFF" w:sz="0"/>
               <w:left w:val="none" w:color="FFFFFF" w:sz="0"/>
@@ -20555,7 +20763,7 @@
         </w:tc>
         <w:tc>
           <w:tcPr>
-            <w:tcW w:type="dxa" w:w="2259"/>
+            <w:tcW w:type="dxa" w:w="2239"/>
             <w:tcBorders>
               <w:top w:val="none" w:color="FFFFFF" w:sz="0"/>
               <w:left w:val="none" w:color="FFFFFF" w:sz="0"/>
@@ -20608,7 +20816,7 @@
         </w:tc>
         <w:tc>
           <w:tcPr>
-            <w:tcW w:type="dxa" w:w="2589"/>
+            <w:tcW w:type="dxa" w:w="2667"/>
             <w:tcBorders>
               <w:top w:val="none" w:color="FFFFFF" w:sz="0"/>
               <w:left w:val="none" w:color="FFFFFF" w:sz="0"/>
@@ -20641,7 +20849,7 @@
         </w:tc>
         <w:tc>
           <w:tcPr>
-            <w:tcW w:type="dxa" w:w="2403"/>
+            <w:tcW w:type="dxa" w:w="2357"/>
             <w:tcBorders>
               <w:top w:val="none" w:color="FFFFFF" w:sz="0"/>
               <w:left w:val="none" w:color="FFFFFF" w:sz="0"/>
@@ -20679,7 +20887,7 @@
         </w:trPr>
         <w:tc>
           <w:tcPr>
-            <w:tcW w:type="dxa" w:w="2109"/>
+            <w:tcW w:type="dxa" w:w="2097"/>
             <w:tcBorders>
               <w:top w:val="none" w:color="FFFFFF" w:sz="0"/>
               <w:left w:val="none" w:color="FFFFFF" w:sz="0"/>
@@ -20712,7 +20920,7 @@
         </w:tc>
         <w:tc>
           <w:tcPr>
-            <w:tcW w:type="dxa" w:w="2259"/>
+            <w:tcW w:type="dxa" w:w="2239"/>
             <w:tcBorders>
               <w:top w:val="none" w:color="FFFFFF" w:sz="0"/>
               <w:left w:val="none" w:color="FFFFFF" w:sz="0"/>
@@ -20745,7 +20953,7 @@
         </w:tc>
         <w:tc>
           <w:tcPr>
-            <w:tcW w:type="dxa" w:w="2589"/>
+            <w:tcW w:type="dxa" w:w="2667"/>
             <w:tcBorders>
               <w:top w:val="none" w:color="FFFFFF" w:sz="0"/>
               <w:left w:val="none" w:color="FFFFFF" w:sz="0"/>
@@ -20778,7 +20986,7 @@
         </w:tc>
         <w:tc>
           <w:tcPr>
-            <w:tcW w:type="dxa" w:w="2403"/>
+            <w:tcW w:type="dxa" w:w="2357"/>
             <w:tcBorders>
               <w:top w:val="none" w:color="FFFFFF" w:sz="0"/>
               <w:left w:val="none" w:color="FFFFFF" w:sz="0"/>
@@ -20825,7 +21033,7 @@
         </w:trPr>
         <w:tc>
           <w:tcPr>
-            <w:tcW w:type="dxa" w:w="2109"/>
+            <w:tcW w:type="dxa" w:w="2097"/>
             <w:tcBorders>
               <w:top w:val="none" w:color="FFFFFF" w:sz="0"/>
               <w:left w:val="none" w:color="FFFFFF" w:sz="0"/>
@@ -20858,7 +21066,7 @@
         </w:tc>
         <w:tc>
           <w:tcPr>
-            <w:tcW w:type="dxa" w:w="2259"/>
+            <w:tcW w:type="dxa" w:w="2239"/>
             <w:tcBorders>
               <w:top w:val="none" w:color="FFFFFF" w:sz="0"/>
               <w:left w:val="none" w:color="FFFFFF" w:sz="0"/>
@@ -20891,7 +21099,7 @@
         </w:tc>
         <w:tc>
           <w:tcPr>
-            <w:tcW w:type="dxa" w:w="2589"/>
+            <w:tcW w:type="dxa" w:w="2667"/>
             <w:tcBorders>
               <w:top w:val="none" w:color="FFFFFF" w:sz="0"/>
               <w:left w:val="none" w:color="FFFFFF" w:sz="0"/>
@@ -20933,7 +21141,7 @@
         </w:tc>
         <w:tc>
           <w:tcPr>
-            <w:tcW w:type="dxa" w:w="2403"/>
+            <w:tcW w:type="dxa" w:w="2357"/>
             <w:tcBorders>
               <w:top w:val="none" w:color="FFFFFF" w:sz="0"/>
               <w:left w:val="none" w:color="FFFFFF" w:sz="0"/>
@@ -20971,7 +21179,7 @@
         </w:trPr>
         <w:tc>
           <w:tcPr>
-            <w:tcW w:type="dxa" w:w="2109"/>
+            <w:tcW w:type="dxa" w:w="2097"/>
             <w:tcBorders>
               <w:top w:val="none" w:color="FFFFFF" w:sz="0"/>
               <w:left w:val="none" w:color="FFFFFF" w:sz="0"/>
@@ -21004,7 +21212,7 @@
         </w:tc>
         <w:tc>
           <w:tcPr>
-            <w:tcW w:type="dxa" w:w="2259"/>
+            <w:tcW w:type="dxa" w:w="2239"/>
             <w:tcBorders>
               <w:top w:val="none" w:color="FFFFFF" w:sz="0"/>
               <w:left w:val="none" w:color="FFFFFF" w:sz="0"/>
@@ -21037,7 +21245,7 @@
         </w:tc>
         <w:tc>
           <w:tcPr>
-            <w:tcW w:type="dxa" w:w="2589"/>
+            <w:tcW w:type="dxa" w:w="2667"/>
             <w:tcBorders>
               <w:top w:val="none" w:color="FFFFFF" w:sz="0"/>
               <w:left w:val="none" w:color="FFFFFF" w:sz="0"/>
@@ -21070,7 +21278,7 @@
         </w:tc>
         <w:tc>
           <w:tcPr>
-            <w:tcW w:type="dxa" w:w="2403"/>
+            <w:tcW w:type="dxa" w:w="2357"/>
             <w:tcBorders>
               <w:top w:val="none" w:color="FFFFFF" w:sz="0"/>
               <w:left w:val="none" w:color="FFFFFF" w:sz="0"/>
@@ -21174,9 +21382,9 @@
         </w:tblBorders>
       </w:tblPr>
       <w:tblGrid>
-        <w:gridCol w:w="3492"/>
-        <w:gridCol w:w="2553"/>
-        <w:gridCol w:w="3315"/>
+        <w:gridCol w:w="3156"/>
+        <w:gridCol w:w="2666"/>
+        <w:gridCol w:w="3538"/>
       </w:tblGrid>
       <w:tr>
         <w:trPr>
@@ -21184,7 +21392,7 @@
         </w:trPr>
         <w:tc>
           <w:tcPr>
-            <w:tcW w:type="dxa" w:w="3492"/>
+            <w:tcW w:type="dxa" w:w="3156"/>
             <w:tcBorders>
               <w:top w:val="single" w:color="000000" w:sz="8"/>
               <w:left w:val="none" w:color="FFFFFF" w:sz="0"/>
@@ -21217,7 +21425,7 @@
         </w:tc>
         <w:tc>
           <w:tcPr>
-            <w:tcW w:type="dxa" w:w="2553"/>
+            <w:tcW w:type="dxa" w:w="2666"/>
             <w:tcBorders>
               <w:top w:val="single" w:color="000000" w:sz="8"/>
               <w:left w:val="none" w:color="FFFFFF" w:sz="0"/>
@@ -21250,7 +21458,7 @@
         </w:tc>
         <w:tc>
           <w:tcPr>
-            <w:tcW w:type="dxa" w:w="3315"/>
+            <w:tcW w:type="dxa" w:w="3538"/>
             <w:tcBorders>
               <w:top w:val="single" w:color="000000" w:sz="8"/>
               <w:left w:val="none" w:color="FFFFFF" w:sz="0"/>
@@ -21288,7 +21496,7 @@
         </w:trPr>
         <w:tc>
           <w:tcPr>
-            <w:tcW w:type="dxa" w:w="3492"/>
+            <w:tcW w:type="dxa" w:w="3156"/>
             <w:tcBorders>
               <w:top w:val="none" w:color="FFFFFF" w:sz="0"/>
               <w:left w:val="none" w:color="FFFFFF" w:sz="0"/>
@@ -21321,7 +21529,7 @@
         </w:tc>
         <w:tc>
           <w:tcPr>
-            <w:tcW w:type="dxa" w:w="2553"/>
+            <w:tcW w:type="dxa" w:w="2666"/>
             <w:tcBorders>
               <w:top w:val="none" w:color="FFFFFF" w:sz="0"/>
               <w:left w:val="none" w:color="FFFFFF" w:sz="0"/>
@@ -21354,7 +21562,7 @@
         </w:tc>
         <w:tc>
           <w:tcPr>
-            <w:tcW w:type="dxa" w:w="3315"/>
+            <w:tcW w:type="dxa" w:w="3538"/>
             <w:tcBorders>
               <w:top w:val="none" w:color="FFFFFF" w:sz="0"/>
               <w:left w:val="none" w:color="FFFFFF" w:sz="0"/>
@@ -21431,7 +21639,7 @@
         </w:trPr>
         <w:tc>
           <w:tcPr>
-            <w:tcW w:type="dxa" w:w="3492"/>
+            <w:tcW w:type="dxa" w:w="3156"/>
             <w:tcBorders>
               <w:top w:val="none" w:color="FFFFFF" w:sz="0"/>
               <w:left w:val="none" w:color="FFFFFF" w:sz="0"/>
@@ -21483,7 +21691,7 @@
         </w:tc>
         <w:tc>
           <w:tcPr>
-            <w:tcW w:type="dxa" w:w="2553"/>
+            <w:tcW w:type="dxa" w:w="2666"/>
             <w:tcBorders>
               <w:top w:val="none" w:color="FFFFFF" w:sz="0"/>
               <w:left w:val="none" w:color="FFFFFF" w:sz="0"/>
@@ -21516,7 +21724,7 @@
         </w:tc>
         <w:tc>
           <w:tcPr>
-            <w:tcW w:type="dxa" w:w="3315"/>
+            <w:tcW w:type="dxa" w:w="3538"/>
             <w:tcBorders>
               <w:top w:val="none" w:color="FFFFFF" w:sz="0"/>
               <w:left w:val="none" w:color="FFFFFF" w:sz="0"/>
@@ -21611,7 +21819,7 @@
         </w:trPr>
         <w:tc>
           <w:tcPr>
-            <w:tcW w:type="dxa" w:w="3492"/>
+            <w:tcW w:type="dxa" w:w="3156"/>
             <w:tcBorders>
               <w:top w:val="none" w:color="FFFFFF" w:sz="0"/>
               <w:left w:val="none" w:color="FFFFFF" w:sz="0"/>
@@ -21644,7 +21852,7 @@
         </w:tc>
         <w:tc>
           <w:tcPr>
-            <w:tcW w:type="dxa" w:w="2553"/>
+            <w:tcW w:type="dxa" w:w="2666"/>
             <w:tcBorders>
               <w:top w:val="none" w:color="FFFFFF" w:sz="0"/>
               <w:left w:val="none" w:color="FFFFFF" w:sz="0"/>
@@ -21695,7 +21903,7 @@
         </w:tc>
         <w:tc>
           <w:tcPr>
-            <w:tcW w:type="dxa" w:w="3315"/>
+            <w:tcW w:type="dxa" w:w="3538"/>
             <w:tcBorders>
               <w:top w:val="none" w:color="FFFFFF" w:sz="0"/>
               <w:left w:val="none" w:color="FFFFFF" w:sz="0"/>
@@ -21733,7 +21941,7 @@
         </w:trPr>
         <w:tc>
           <w:tcPr>
-            <w:tcW w:type="dxa" w:w="3492"/>
+            <w:tcW w:type="dxa" w:w="3156"/>
             <w:tcBorders>
               <w:top w:val="none" w:color="FFFFFF" w:sz="0"/>
               <w:left w:val="none" w:color="FFFFFF" w:sz="0"/>
@@ -21766,7 +21974,7 @@
         </w:tc>
         <w:tc>
           <w:tcPr>
-            <w:tcW w:type="dxa" w:w="2553"/>
+            <w:tcW w:type="dxa" w:w="2666"/>
             <w:tcBorders>
               <w:top w:val="none" w:color="FFFFFF" w:sz="0"/>
               <w:left w:val="none" w:color="FFFFFF" w:sz="0"/>
@@ -21799,7 +22007,7 @@
         </w:tc>
         <w:tc>
           <w:tcPr>
-            <w:tcW w:type="dxa" w:w="3315"/>
+            <w:tcW w:type="dxa" w:w="3538"/>
             <w:tcBorders>
               <w:top w:val="none" w:color="FFFFFF" w:sz="0"/>
               <w:left w:val="none" w:color="FFFFFF" w:sz="0"/>
@@ -21837,7 +22045,7 @@
         </w:trPr>
         <w:tc>
           <w:tcPr>
-            <w:tcW w:type="dxa" w:w="3492"/>
+            <w:tcW w:type="dxa" w:w="3156"/>
             <w:tcBorders>
               <w:top w:val="none" w:color="FFFFFF" w:sz="0"/>
               <w:left w:val="none" w:color="FFFFFF" w:sz="0"/>
@@ -21888,7 +22096,7 @@
         </w:tc>
         <w:tc>
           <w:tcPr>
-            <w:tcW w:type="dxa" w:w="2553"/>
+            <w:tcW w:type="dxa" w:w="2666"/>
             <w:tcBorders>
               <w:top w:val="none" w:color="FFFFFF" w:sz="0"/>
               <w:left w:val="none" w:color="FFFFFF" w:sz="0"/>
@@ -21921,7 +22129,7 @@
         </w:tc>
         <w:tc>
           <w:tcPr>
-            <w:tcW w:type="dxa" w:w="3315"/>
+            <w:tcW w:type="dxa" w:w="3538"/>
             <w:tcBorders>
               <w:top w:val="none" w:color="FFFFFF" w:sz="0"/>
               <w:left w:val="none" w:color="FFFFFF" w:sz="0"/>
@@ -21959,7 +22167,7 @@
         </w:trPr>
         <w:tc>
           <w:tcPr>
-            <w:tcW w:type="dxa" w:w="3492"/>
+            <w:tcW w:type="dxa" w:w="3156"/>
             <w:tcBorders>
               <w:top w:val="none" w:color="FFFFFF" w:sz="0"/>
               <w:left w:val="none" w:color="FFFFFF" w:sz="0"/>
@@ -21992,7 +22200,7 @@
         </w:tc>
         <w:tc>
           <w:tcPr>
-            <w:tcW w:type="dxa" w:w="2553"/>
+            <w:tcW w:type="dxa" w:w="2666"/>
             <w:tcBorders>
               <w:top w:val="none" w:color="FFFFFF" w:sz="0"/>
               <w:left w:val="none" w:color="FFFFFF" w:sz="0"/>
@@ -22021,38 +22229,66 @@
               </w:rPr>
               <w:t xml:space="preserve">0</w:t>
             </w:r>
-          </w:p>
-        </w:tc>
-        <w:tc>
-          <w:tcPr>
-            <w:tcW w:type="dxa" w:w="3315"/>
-            <w:tcBorders>
-              <w:top w:val="none" w:color="FFFFFF" w:sz="0"/>
-              <w:left w:val="none" w:color="FFFFFF" w:sz="0"/>
-              <w:bottom w:val="none" w:color="FFFFFF" w:sz="0"/>
-              <w:right w:val="none" w:color="FFFFFF" w:sz="0"/>
-            </w:tcBorders>
-            <w:tcMar>
-              <w:top w:type="dxa" w:w="60"/>
-              <w:left w:type="dxa" w:w="80"/>
-              <w:bottom w:type="dxa" w:w="60"/>
-              <w:right w:type="dxa" w:w="80"/>
-            </w:tcMar>
-            <w:vAlign w:val="top"/>
-          </w:tcPr>
-          <w:p>
-            <w:pPr>
-              <w:keepNext w:val="false"/>
-              <w:spacing w:after="0" w:line="240" w:lineRule="auto"/>
-            </w:pPr>
-            <w:r>
-              <w:rPr>
-                <w:b w:val="false"/>
-                <w:bCs w:val="false"/>
-                <w:sz w:val="20"/>
-                <w:szCs w:val="20"/>
-              </w:rPr>
-              <w:t xml:space="preserve">Retención de 72 h, offset confirmado solo después de procesar y reintentos sin límite para fallas transitorias</w:t>
+            <w:r>
+              <w:rPr>
+                <w:b w:val="false"/>
+                <w:bCs w:val="false"/>
+                <w:sz w:val="20"/>
+                <w:szCs w:val="20"/>
+              </w:rPr>
+              <w:t xml:space="preserve"> (mientras la caída del consumidor dure menos que la retención)</w:t>
+            </w:r>
+          </w:p>
+        </w:tc>
+        <w:tc>
+          <w:tcPr>
+            <w:tcW w:type="dxa" w:w="3538"/>
+            <w:tcBorders>
+              <w:top w:val="none" w:color="FFFFFF" w:sz="0"/>
+              <w:left w:val="none" w:color="FFFFFF" w:sz="0"/>
+              <w:bottom w:val="none" w:color="FFFFFF" w:sz="0"/>
+              <w:right w:val="none" w:color="FFFFFF" w:sz="0"/>
+            </w:tcBorders>
+            <w:tcMar>
+              <w:top w:type="dxa" w:w="60"/>
+              <w:left w:type="dxa" w:w="80"/>
+              <w:bottom w:type="dxa" w:w="60"/>
+              <w:right w:type="dxa" w:w="80"/>
+            </w:tcMar>
+            <w:vAlign w:val="top"/>
+          </w:tcPr>
+          <w:p>
+            <w:pPr>
+              <w:keepNext w:val="false"/>
+              <w:spacing w:after="0" w:line="240" w:lineRule="auto"/>
+            </w:pPr>
+            <w:r>
+              <w:rPr>
+                <w:b w:val="false"/>
+                <w:bCs w:val="false"/>
+                <w:sz w:val="20"/>
+                <w:szCs w:val="20"/>
+              </w:rPr>
+              <w:t xml:space="preserve">Retención de 24 h en los topics crudos y 72 h en </w:t>
+            </w:r>
+            <w:r>
+              <w:rPr>
+                <w:rFonts w:ascii="Courier New" w:cs="Courier New" w:eastAsia="Courier New" w:hAnsi="Courier New"/>
+                <w:b w:val="false"/>
+                <w:bCs w:val="false"/>
+                <w:sz w:val="18"/>
+                <w:szCs w:val="18"/>
+              </w:rPr>
+              <w:t xml:space="preserve">events.normalized</w:t>
+            </w:r>
+            <w:r>
+              <w:rPr>
+                <w:b w:val="false"/>
+                <w:bCs w:val="false"/>
+                <w:sz w:val="20"/>
+                <w:szCs w:val="20"/>
+              </w:rPr>
+              <w:t xml:space="preserve">, offset confirmado solo después de procesar y reintentos sin límite para fallas transitorias</w:t>
             </w:r>
           </w:p>
         </w:tc>
@@ -22063,7 +22299,7 @@
         </w:trPr>
         <w:tc>
           <w:tcPr>
-            <w:tcW w:type="dxa" w:w="3492"/>
+            <w:tcW w:type="dxa" w:w="3156"/>
             <w:tcBorders>
               <w:top w:val="none" w:color="FFFFFF" w:sz="0"/>
               <w:left w:val="none" w:color="FFFFFF" w:sz="0"/>
@@ -22096,7 +22332,7 @@
         </w:tc>
         <w:tc>
           <w:tcPr>
-            <w:tcW w:type="dxa" w:w="2553"/>
+            <w:tcW w:type="dxa" w:w="2666"/>
             <w:tcBorders>
               <w:top w:val="none" w:color="FFFFFF" w:sz="0"/>
               <w:left w:val="none" w:color="FFFFFF" w:sz="0"/>
@@ -22129,7 +22365,7 @@
         </w:tc>
         <w:tc>
           <w:tcPr>
-            <w:tcW w:type="dxa" w:w="3315"/>
+            <w:tcW w:type="dxa" w:w="3538"/>
             <w:tcBorders>
               <w:top w:val="none" w:color="FFFFFF" w:sz="0"/>
               <w:left w:val="none" w:color="FFFFFF" w:sz="0"/>
@@ -22767,7 +23003,7 @@
                 <w:sz w:val="20"/>
                 <w:szCs w:val="20"/>
               </w:rPr>
-              <w:t xml:space="preserve">Rechaza lo nuevo, lo registra y lo cuenta (</w:t>
+              <w:t xml:space="preserve">Rechaza lo nuevo y lo registra en el log; se ve como </w:t>
             </w:r>
             <w:r>
               <w:rPr>
@@ -22777,16 +23013,45 @@
                 <w:sz w:val="18"/>
                 <w:szCs w:val="18"/>
               </w:rPr>
-              <w:t xml:space="preserve">simulator_spool_rejected_total</w:t>
-            </w:r>
-            <w:r>
-              <w:rPr>
-                <w:b w:val="false"/>
-                <w:bCs w:val="false"/>
-                <w:sz w:val="20"/>
-                <w:szCs w:val="20"/>
-              </w:rPr>
-              <w:t xml:space="preserve">)</w:t>
+              <w:t xml:space="preserve">rechazadosPorTope</w:t>
+            </w:r>
+            <w:r>
+              <w:rPr>
+                <w:b w:val="false"/>
+                <w:bCs w:val="false"/>
+                <w:sz w:val="20"/>
+                <w:szCs w:val="20"/>
+              </w:rPr>
+              <w:t xml:space="preserve"> en </w:t>
+            </w:r>
+            <w:r>
+              <w:rPr>
+                <w:rFonts w:ascii="Courier New" w:cs="Courier New" w:eastAsia="Courier New" w:hAnsi="Courier New"/>
+                <w:b w:val="false"/>
+                <w:bCs w:val="false"/>
+                <w:sz w:val="18"/>
+                <w:szCs w:val="18"/>
+              </w:rPr>
+              <w:t xml:space="preserve">/api/simulator/spool</w:t>
+            </w:r>
+            <w:r>
+              <w:rPr>
+                <w:b w:val="false"/>
+                <w:bCs w:val="false"/>
+                <w:sz w:val="20"/>
+                <w:szCs w:val="20"/>
+              </w:rPr>
+              <w:t xml:space="preserve"> y el evento perdido cuenta en </w:t>
+            </w:r>
+            <w:r>
+              <w:rPr>
+                <w:rFonts w:ascii="Courier New" w:cs="Courier New" w:eastAsia="Courier New" w:hAnsi="Courier New"/>
+                <w:b w:val="false"/>
+                <w:bCs w:val="false"/>
+                <w:sz w:val="18"/>
+                <w:szCs w:val="18"/>
+              </w:rPr>
+              <w:t xml:space="preserve">simulator_events_sent_total{result="lost"}</w:t>
             </w:r>
           </w:p>
         </w:tc>
@@ -23481,7 +23746,7 @@
                 <w:sz w:val="20"/>
                 <w:szCs w:val="20"/>
               </w:rPr>
-              <w:t xml:space="preserve">TRANSITORIA</w:t>
+              <w:t xml:space="preserve">TRANSITORIO</w:t>
             </w:r>
           </w:p>
         </w:tc>
@@ -23685,7 +23950,7 @@
                 <w:sz w:val="20"/>
                 <w:szCs w:val="20"/>
               </w:rPr>
-              <w:t xml:space="preserve">DESCONOCIDA</w:t>
+              <w:t xml:space="preserve">DESCONOCIDO</w:t>
             </w:r>
           </w:p>
         </w:tc>
@@ -24434,7 +24699,7 @@
         <w:t xml:space="preserve">pg_dump</w:t>
       </w:r>
       <w:r>
-        <w:t xml:space="preserve"> cada 6 h (se guardan 8) y restauración con </w:t>
+        <w:t xml:space="preserve"> cada 6 h (se guardan 8; una base vacía no se respalda y un reinicio no rota respaldos buenos) y restauración con </w:t>
       </w:r>
       <w:r>
         <w:rPr>
@@ -24445,7 +24710,7 @@
         <w:t xml:space="preserve">centinela.cmd restaurar</w:t>
       </w:r>
       <w:r>
-        <w:t xml:space="preserve">.</w:t>
+        <w:t xml:space="preserve">, que restaura en una base temporal y luego la intercambia por la actual, sin detener los servicios.</w:t>
       </w:r>
     </w:p>
     <w:p>
@@ -31667,10 +31932,10 @@
         </w:tblBorders>
       </w:tblPr>
       <w:tblGrid>
-        <w:gridCol w:w="2399"/>
-        <w:gridCol w:w="3690"/>
-        <w:gridCol w:w="1948"/>
-        <w:gridCol w:w="1323"/>
+        <w:gridCol w:w="2154"/>
+        <w:gridCol w:w="2999"/>
+        <w:gridCol w:w="2607"/>
+        <w:gridCol w:w="1600"/>
       </w:tblGrid>
       <w:tr>
         <w:trPr>
@@ -31678,7 +31943,7 @@
         </w:trPr>
         <w:tc>
           <w:tcPr>
-            <w:tcW w:type="dxa" w:w="2399"/>
+            <w:tcW w:type="dxa" w:w="2154"/>
             <w:tcBorders>
               <w:top w:val="single" w:color="000000" w:sz="8"/>
               <w:left w:val="none" w:color="FFFFFF" w:sz="0"/>
@@ -31711,7 +31976,7 @@
         </w:tc>
         <w:tc>
           <w:tcPr>
-            <w:tcW w:type="dxa" w:w="3690"/>
+            <w:tcW w:type="dxa" w:w="2999"/>
             <w:tcBorders>
               <w:top w:val="single" w:color="000000" w:sz="8"/>
               <w:left w:val="none" w:color="FFFFFF" w:sz="0"/>
@@ -31744,7 +32009,7 @@
         </w:tc>
         <w:tc>
           <w:tcPr>
-            <w:tcW w:type="dxa" w:w="1948"/>
+            <w:tcW w:type="dxa" w:w="2607"/>
             <w:tcBorders>
               <w:top w:val="single" w:color="000000" w:sz="8"/>
               <w:left w:val="none" w:color="FFFFFF" w:sz="0"/>
@@ -31777,7 +32042,7 @@
         </w:tc>
         <w:tc>
           <w:tcPr>
-            <w:tcW w:type="dxa" w:w="1323"/>
+            <w:tcW w:type="dxa" w:w="1600"/>
             <w:tcBorders>
               <w:top w:val="single" w:color="000000" w:sz="8"/>
               <w:left w:val="none" w:color="FFFFFF" w:sz="0"/>
@@ -31815,7 +32080,7 @@
         </w:trPr>
         <w:tc>
           <w:tcPr>
-            <w:tcW w:type="dxa" w:w="2399"/>
+            <w:tcW w:type="dxa" w:w="2154"/>
             <w:tcBorders>
               <w:top w:val="none" w:color="FFFFFF" w:sz="0"/>
               <w:left w:val="none" w:color="FFFFFF" w:sz="0"/>
@@ -31848,7 +32113,7 @@
         </w:tc>
         <w:tc>
           <w:tcPr>
-            <w:tcW w:type="dxa" w:w="3690"/>
+            <w:tcW w:type="dxa" w:w="2999"/>
             <w:tcBorders>
               <w:top w:val="none" w:color="FFFFFF" w:sz="0"/>
               <w:left w:val="none" w:color="FFFFFF" w:sz="0"/>
@@ -31899,7 +32164,7 @@
         </w:tc>
         <w:tc>
           <w:tcPr>
-            <w:tcW w:type="dxa" w:w="1948"/>
+            <w:tcW w:type="dxa" w:w="2607"/>
             <w:tcBorders>
               <w:top w:val="none" w:color="FFFFFF" w:sz="0"/>
               <w:left w:val="none" w:color="FFFFFF" w:sz="0"/>
@@ -31932,7 +32197,7 @@
         </w:tc>
         <w:tc>
           <w:tcPr>
-            <w:tcW w:type="dxa" w:w="1323"/>
+            <w:tcW w:type="dxa" w:w="1600"/>
             <w:tcBorders>
               <w:top w:val="none" w:color="FFFFFF" w:sz="0"/>
               <w:left w:val="none" w:color="FFFFFF" w:sz="0"/>
@@ -31970,7 +32235,7 @@
         </w:trPr>
         <w:tc>
           <w:tcPr>
-            <w:tcW w:type="dxa" w:w="2399"/>
+            <w:tcW w:type="dxa" w:w="2154"/>
             <w:tcBorders>
               <w:top w:val="none" w:color="FFFFFF" w:sz="0"/>
               <w:left w:val="none" w:color="FFFFFF" w:sz="0"/>
@@ -32003,7 +32268,7 @@
         </w:tc>
         <w:tc>
           <w:tcPr>
-            <w:tcW w:type="dxa" w:w="3690"/>
+            <w:tcW w:type="dxa" w:w="2999"/>
             <w:tcBorders>
               <w:top w:val="none" w:color="FFFFFF" w:sz="0"/>
               <w:left w:val="none" w:color="FFFFFF" w:sz="0"/>
@@ -32046,7 +32311,7 @@
         </w:tc>
         <w:tc>
           <w:tcPr>
-            <w:tcW w:type="dxa" w:w="1948"/>
+            <w:tcW w:type="dxa" w:w="2607"/>
             <w:tcBorders>
               <w:top w:val="none" w:color="FFFFFF" w:sz="0"/>
               <w:left w:val="none" w:color="FFFFFF" w:sz="0"/>
@@ -32079,7 +32344,7 @@
         </w:tc>
         <w:tc>
           <w:tcPr>
-            <w:tcW w:type="dxa" w:w="1323"/>
+            <w:tcW w:type="dxa" w:w="1600"/>
             <w:tcBorders>
               <w:top w:val="none" w:color="FFFFFF" w:sz="0"/>
               <w:left w:val="none" w:color="FFFFFF" w:sz="0"/>
@@ -32117,7 +32382,7 @@
         </w:trPr>
         <w:tc>
           <w:tcPr>
-            <w:tcW w:type="dxa" w:w="2399"/>
+            <w:tcW w:type="dxa" w:w="2154"/>
             <w:tcBorders>
               <w:top w:val="none" w:color="FFFFFF" w:sz="0"/>
               <w:left w:val="none" w:color="FFFFFF" w:sz="0"/>
@@ -32150,7 +32415,7 @@
         </w:tc>
         <w:tc>
           <w:tcPr>
-            <w:tcW w:type="dxa" w:w="3690"/>
+            <w:tcW w:type="dxa" w:w="2999"/>
             <w:tcBorders>
               <w:top w:val="none" w:color="FFFFFF" w:sz="0"/>
               <w:left w:val="none" w:color="FFFFFF" w:sz="0"/>
@@ -32183,7 +32448,7 @@
         </w:tc>
         <w:tc>
           <w:tcPr>
-            <w:tcW w:type="dxa" w:w="1948"/>
+            <w:tcW w:type="dxa" w:w="2607"/>
             <w:tcBorders>
               <w:top w:val="none" w:color="FFFFFF" w:sz="0"/>
               <w:left w:val="none" w:color="FFFFFF" w:sz="0"/>
@@ -32216,7 +32481,7 @@
         </w:tc>
         <w:tc>
           <w:tcPr>
-            <w:tcW w:type="dxa" w:w="1323"/>
+            <w:tcW w:type="dxa" w:w="1600"/>
             <w:tcBorders>
               <w:top w:val="none" w:color="FFFFFF" w:sz="0"/>
               <w:left w:val="none" w:color="FFFFFF" w:sz="0"/>
@@ -32254,7 +32519,7 @@
         </w:trPr>
         <w:tc>
           <w:tcPr>
-            <w:tcW w:type="dxa" w:w="2399"/>
+            <w:tcW w:type="dxa" w:w="2154"/>
             <w:tcBorders>
               <w:top w:val="none" w:color="FFFFFF" w:sz="0"/>
               <w:left w:val="none" w:color="FFFFFF" w:sz="0"/>
@@ -32287,7 +32552,7 @@
         </w:tc>
         <w:tc>
           <w:tcPr>
-            <w:tcW w:type="dxa" w:w="3690"/>
+            <w:tcW w:type="dxa" w:w="2999"/>
             <w:tcBorders>
               <w:top w:val="none" w:color="FFFFFF" w:sz="0"/>
               <w:left w:val="none" w:color="FFFFFF" w:sz="0"/>
@@ -32314,7 +32579,7 @@
                 <w:sz w:val="20"/>
                 <w:szCs w:val="20"/>
               </w:rPr>
-              <w:t xml:space="preserve">Lag del grupo </w:t>
+              <w:t xml:space="preserve">Atraso total de los grupos </w:t>
             </w:r>
             <w:r>
               <w:rPr>
@@ -32324,6 +32589,25 @@
                 <w:sz w:val="18"/>
                 <w:szCs w:val="18"/>
               </w:rPr>
+              <w:t xml:space="preserve">ingestion</w:t>
+            </w:r>
+            <w:r>
+              <w:rPr>
+                <w:b w:val="false"/>
+                <w:bCs w:val="false"/>
+                <w:sz w:val="20"/>
+                <w:szCs w:val="20"/>
+              </w:rPr>
+              <w:t xml:space="preserve">, </w:t>
+            </w:r>
+            <w:r>
+              <w:rPr>
+                <w:rFonts w:ascii="Courier New" w:cs="Courier New" w:eastAsia="Courier New" w:hAnsi="Courier New"/>
+                <w:b w:val="false"/>
+                <w:bCs w:val="false"/>
+                <w:sz w:val="18"/>
+                <w:szCs w:val="18"/>
+              </w:rPr>
               <w:t xml:space="preserve">correlation</w:t>
             </w:r>
             <w:r>
@@ -32333,13 +32617,51 @@
                 <w:sz w:val="20"/>
                 <w:szCs w:val="20"/>
               </w:rPr>
+              <w:t xml:space="preserve">, </w:t>
+            </w:r>
+            <w:r>
+              <w:rPr>
+                <w:rFonts w:ascii="Courier New" w:cs="Courier New" w:eastAsia="Courier New" w:hAnsi="Courier New"/>
+                <w:b w:val="false"/>
+                <w:bCs w:val="false"/>
+                <w:sz w:val="18"/>
+                <w:szCs w:val="18"/>
+              </w:rPr>
+              <w:t xml:space="preserve">event-store</w:t>
+            </w:r>
+            <w:r>
+              <w:rPr>
+                <w:b w:val="false"/>
+                <w:bCs w:val="false"/>
+                <w:sz w:val="20"/>
+                <w:szCs w:val="20"/>
+              </w:rPr>
+              <w:t xml:space="preserve"> y </w:t>
+            </w:r>
+            <w:r>
+              <w:rPr>
+                <w:rFonts w:ascii="Courier New" w:cs="Courier New" w:eastAsia="Courier New" w:hAnsi="Courier New"/>
+                <w:b w:val="false"/>
+                <w:bCs w:val="false"/>
+                <w:sz w:val="18"/>
+                <w:szCs w:val="18"/>
+              </w:rPr>
+              <w:t xml:space="preserve">alert-store</w:t>
+            </w:r>
+            <w:r>
+              <w:rPr>
+                <w:b w:val="false"/>
+                <w:bCs w:val="false"/>
+                <w:sz w:val="20"/>
+                <w:szCs w:val="20"/>
+              </w:rPr>
               <w:t xml:space="preserve"> en Kafka</w:t>
             </w:r>
           </w:p>
         </w:tc>
         <w:tc>
           <w:tcPr>
-            <w:tcW w:type="dxa" w:w="1948"/>
+            <w:tcW w:type="dxa" w:w="2607"/>
             <w:tcBorders>
               <w:top w:val="none" w:color="FFFFFF" w:sz="0"/>
               <w:left w:val="none" w:color="FFFFFF" w:sz="0"/>
@@ -32366,13 +32688,13 @@
                 <w:sz w:val="20"/>
                 <w:szCs w:val="20"/>
               </w:rPr>
-              <w:t xml:space="preserve">&lt; 1 000 mensajes sostenidos</w:t>
-            </w:r>
-          </w:p>
-        </w:tc>
-        <w:tc>
-          <w:tcPr>
-            <w:tcW w:type="dxa" w:w="1323"/>
+              <w:t xml:space="preserve">&lt; 1 000 mensajes (incumple si es ≥ 1 000 y no baja en dos mediciones seguidas)</w:t>
+            </w:r>
+          </w:p>
+        </w:tc>
+        <w:tc>
+          <w:tcPr>
+            <w:tcW w:type="dxa" w:w="1600"/>
             <w:tcBorders>
               <w:top w:val="none" w:color="FFFFFF" w:sz="0"/>
               <w:left w:val="none" w:color="FFFFFF" w:sz="0"/>
@@ -32399,7 +32721,7 @@
                 <w:sz w:val="20"/>
                 <w:szCs w:val="20"/>
               </w:rPr>
-              <w:t xml:space="preserve">5 min</w:t>
+              <w:t xml:space="preserve">2 mediciones de 30 s</w:t>
             </w:r>
           </w:p>
         </w:tc>

</xml_diff>

<commit_message>
Informe y anexo con los defectos encontrados al grabar el video
Regenera el informe (32 paginas) y el anexo de ADRs: 95 pruebas, la
evidencia de R6 y los tres defectos encontrados y corregidos en vivo,
con la latencia medida antes (74 s) y despues (36 ms).

Co-Authored-By: Claude Opus 5.5 <noreply@anthropic.com>
Claude-Session: https://claude.ai/code/session_01SKDRaqP2Mxb64nZs4eFdyh
</commit_message>
<xml_diff>
--- a/informe/Anexo-A-ADRs.docx
+++ b/informe/Anexo-A-ADRs.docx
@@ -25502,7 +25502,7 @@
                 <w:sz w:val="20"/>
                 <w:szCs w:val="20"/>
               </w:rPr>
-              <w:t xml:space="preserve">90 pruebas, todas en verde (incluye: línea truncada por corte de luz, compactación, reinicio con pendientes, reintento del mismo mensaje, muerte entre publicar y guardar).</w:t>
+              <w:t xml:space="preserve">95 pruebas, todas en verde (incluye: línea truncada por corte de luz, compactación, reinicio con pendientes, reintento del mismo mensaje, muerte entre publicar y guardar).</w:t>
             </w:r>
           </w:p>
         </w:tc>
@@ -40943,7 +40943,7 @@
         <w:jc w:val="both"/>
       </w:pPr>
       <w:r>
-        <w:t xml:space="preserve">90 pruebas unitarias; las del motor usan las reglas reales del YAML y las de resiliencia simulan cortes de luz, fallas de Kafka y muertes de proceso;</w:t>
+        <w:t xml:space="preserve">95 pruebas unitarias; las del motor usan las reglas reales del YAML y las de resiliencia simulan cortes de luz, fallas de Kafka y muertes de proceso;</w:t>
       </w:r>
     </w:p>
     <w:p>

</xml_diff>

<commit_message>
ADR-002: comparacion exacta con RabbitMQ Streams
RabbitMQ tiene desde la 3.11 super streams con un consumidor activo por
particion; el ADR decia que no habia reparto de particiones. Se corrige la
tabla (modelo, reproceso y orden) y la guia de estudio agrega la respuesta:
Kafka no se eligio por velocidad sino por su modelo de log, que en RabbitMQ
es una funcion reciente al lado de las colas.

Co-Authored-By: Claude Opus 5.5 <noreply@anthropic.com>
Claude-Session: https://claude.ai/code/session_01SKDRaqP2Mxb64nZs4eFdyh
</commit_message>
<xml_diff>
--- a/informe/Anexo-A-ADRs.docx
+++ b/informe/Anexo-A-ADRs.docx
@@ -735,7 +735,7 @@
             <w:tab/>
           </w:r>
           <w:r>
-            <w:t>14</w:t>
+            <w:t>15</w:t>
           </w:r>
         </w:p>
         <w:p>
@@ -771,7 +771,7 @@
             <w:tab/>
           </w:r>
           <w:r>
-            <w:t>16</w:t>
+            <w:t>17</w:t>
           </w:r>
         </w:p>
         <w:p>
@@ -789,7 +789,7 @@
             <w:tab/>
           </w:r>
           <w:r>
-            <w:t>16</w:t>
+            <w:t>17</w:t>
           </w:r>
         </w:p>
         <w:p>
@@ -807,7 +807,7 @@
             <w:tab/>
           </w:r>
           <w:r>
-            <w:t>16</w:t>
+            <w:t>17</w:t>
           </w:r>
         </w:p>
         <w:p>
@@ -825,7 +825,7 @@
             <w:tab/>
           </w:r>
           <w:r>
-            <w:t>17</w:t>
+            <w:t>18</w:t>
           </w:r>
         </w:p>
         <w:p>
@@ -843,7 +843,7 @@
             <w:tab/>
           </w:r>
           <w:r>
-            <w:t>18</w:t>
+            <w:t>19</w:t>
           </w:r>
         </w:p>
         <w:p>
@@ -861,7 +861,7 @@
             <w:tab/>
           </w:r>
           <w:r>
-            <w:t>19</w:t>
+            <w:t>20</w:t>
           </w:r>
         </w:p>
         <w:p>
@@ -879,7 +879,7 @@
             <w:tab/>
           </w:r>
           <w:r>
-            <w:t>20</w:t>
+            <w:t>21</w:t>
           </w:r>
         </w:p>
         <w:p>
@@ -897,7 +897,7 @@
             <w:tab/>
           </w:r>
           <w:r>
-            <w:t>21</w:t>
+            <w:t>22</w:t>
           </w:r>
         </w:p>
         <w:p>
@@ -915,7 +915,7 @@
             <w:tab/>
           </w:r>
           <w:r>
-            <w:t>21</w:t>
+            <w:t>22</w:t>
           </w:r>
         </w:p>
         <w:p>
@@ -933,7 +933,7 @@
             <w:tab/>
           </w:r>
           <w:r>
-            <w:t>22</w:t>
+            <w:t>23</w:t>
           </w:r>
         </w:p>
         <w:p>
@@ -951,7 +951,7 @@
             <w:tab/>
           </w:r>
           <w:r>
-            <w:t>23</w:t>
+            <w:t>24</w:t>
           </w:r>
         </w:p>
         <w:p>
@@ -969,7 +969,7 @@
             <w:tab/>
           </w:r>
           <w:r>
-            <w:t>24</w:t>
+            <w:t>25</w:t>
           </w:r>
         </w:p>
         <w:p>
@@ -987,7 +987,7 @@
             <w:tab/>
           </w:r>
           <w:r>
-            <w:t>25</w:t>
+            <w:t>26</w:t>
           </w:r>
         </w:p>
         <w:p>
@@ -1005,7 +1005,7 @@
             <w:tab/>
           </w:r>
           <w:r>
-            <w:t>26</w:t>
+            <w:t>27</w:t>
           </w:r>
         </w:p>
         <w:p>
@@ -1023,7 +1023,7 @@
             <w:tab/>
           </w:r>
           <w:r>
-            <w:t>26</w:t>
+            <w:t>27</w:t>
           </w:r>
         </w:p>
         <w:p>
@@ -1041,7 +1041,7 @@
             <w:tab/>
           </w:r>
           <w:r>
-            <w:t>27</w:t>
+            <w:t>28</w:t>
           </w:r>
         </w:p>
         <w:p>
@@ -1059,7 +1059,7 @@
             <w:tab/>
           </w:r>
           <w:r>
-            <w:t>28</w:t>
+            <w:t>29</w:t>
           </w:r>
         </w:p>
         <w:p>
@@ -1077,7 +1077,7 @@
             <w:tab/>
           </w:r>
           <w:r>
-            <w:t>29</w:t>
+            <w:t>30</w:t>
           </w:r>
         </w:p>
         <w:p>
@@ -1095,7 +1095,7 @@
             <w:tab/>
           </w:r>
           <w:r>
-            <w:t>30</w:t>
+            <w:t>31</w:t>
           </w:r>
         </w:p>
         <w:p>
@@ -1113,7 +1113,7 @@
             <w:tab/>
           </w:r>
           <w:r>
-            <w:t>31</w:t>
+            <w:t>32</w:t>
           </w:r>
         </w:p>
         <w:p>
@@ -1131,7 +1131,7 @@
             <w:tab/>
           </w:r>
           <w:r>
-            <w:t>31</w:t>
+            <w:t>32</w:t>
           </w:r>
         </w:p>
         <w:p>
@@ -1149,7 +1149,7 @@
             <w:tab/>
           </w:r>
           <w:r>
-            <w:t>32</w:t>
+            <w:t>33</w:t>
           </w:r>
         </w:p>
         <w:p>
@@ -1167,7 +1167,7 @@
             <w:tab/>
           </w:r>
           <w:r>
-            <w:t>33</w:t>
+            <w:t>34</w:t>
           </w:r>
         </w:p>
         <w:p>
@@ -1185,7 +1185,7 @@
             <w:tab/>
           </w:r>
           <w:r>
-            <w:t>33</w:t>
+            <w:t>34</w:t>
           </w:r>
         </w:p>
         <w:p>
@@ -1203,7 +1203,7 @@
             <w:tab/>
           </w:r>
           <w:r>
-            <w:t>35</w:t>
+            <w:t>36</w:t>
           </w:r>
         </w:p>
         <w:p>
@@ -1221,7 +1221,7 @@
             <w:tab/>
           </w:r>
           <w:r>
-            <w:t>40</w:t>
+            <w:t>41</w:t>
           </w:r>
         </w:p>
         <w:p>
@@ -1239,7 +1239,7 @@
             <w:tab/>
           </w:r>
           <w:r>
-            <w:t>42</w:t>
+            <w:t>43</w:t>
           </w:r>
         </w:p>
         <w:p>
@@ -1257,7 +1257,7 @@
             <w:tab/>
           </w:r>
           <w:r>
-            <w:t>43</w:t>
+            <w:t>44</w:t>
           </w:r>
         </w:p>
         <w:p>
@@ -1275,7 +1275,7 @@
             <w:tab/>
           </w:r>
           <w:r>
-            <w:t>44</w:t>
+            <w:t>45</w:t>
           </w:r>
         </w:p>
         <w:p>
@@ -1293,7 +1293,7 @@
             <w:tab/>
           </w:r>
           <w:r>
-            <w:t>45</w:t>
+            <w:t>46</w:t>
           </w:r>
         </w:p>
         <w:p>
@@ -1311,7 +1311,7 @@
             <w:tab/>
           </w:r>
           <w:r>
-            <w:t>45</w:t>
+            <w:t>46</w:t>
           </w:r>
         </w:p>
         <w:p>
@@ -1329,7 +1329,7 @@
             <w:tab/>
           </w:r>
           <w:r>
-            <w:t>46</w:t>
+            <w:t>47</w:t>
           </w:r>
         </w:p>
         <w:p>
@@ -1347,7 +1347,7 @@
             <w:tab/>
           </w:r>
           <w:r>
-            <w:t>48</w:t>
+            <w:t>49</w:t>
           </w:r>
         </w:p>
         <w:p>
@@ -1365,7 +1365,7 @@
             <w:tab/>
           </w:r>
           <w:r>
-            <w:t>51</w:t>
+            <w:t>52</w:t>
           </w:r>
         </w:p>
         <w:p>
@@ -1383,7 +1383,7 @@
             <w:tab/>
           </w:r>
           <w:r>
-            <w:t>52</w:t>
+            <w:t>53</w:t>
           </w:r>
         </w:p>
         <w:p>
@@ -1401,7 +1401,7 @@
             <w:tab/>
           </w:r>
           <w:r>
-            <w:t>53</w:t>
+            <w:t>54</w:t>
           </w:r>
         </w:p>
         <w:p>
@@ -1419,7 +1419,7 @@
             <w:tab/>
           </w:r>
           <w:r>
-            <w:t>53</w:t>
+            <w:t>54</w:t>
           </w:r>
         </w:p>
         <w:p>
@@ -1437,7 +1437,7 @@
             <w:tab/>
           </w:r>
           <w:r>
-            <w:t>54</w:t>
+            <w:t>55</w:t>
           </w:r>
         </w:p>
         <w:p>
@@ -1455,7 +1455,7 @@
             <w:tab/>
           </w:r>
           <w:r>
-            <w:t>54</w:t>
+            <w:t>55</w:t>
           </w:r>
         </w:p>
         <w:p>
@@ -1473,7 +1473,7 @@
             <w:tab/>
           </w:r>
           <w:r>
-            <w:t>55</w:t>
+            <w:t>56</w:t>
           </w:r>
         </w:p>
         <w:p>
@@ -1491,7 +1491,7 @@
             <w:tab/>
           </w:r>
           <w:r>
-            <w:t>56</w:t>
+            <w:t>57</w:t>
           </w:r>
         </w:p>
         <w:p>
@@ -1509,7 +1509,7 @@
             <w:tab/>
           </w:r>
           <w:r>
-            <w:t>58</w:t>
+            <w:t>59</w:t>
           </w:r>
         </w:p>
         <w:p>
@@ -1527,7 +1527,7 @@
             <w:tab/>
           </w:r>
           <w:r>
-            <w:t>59</w:t>
+            <w:t>60</w:t>
           </w:r>
         </w:p>
         <w:p>
@@ -1545,7 +1545,7 @@
             <w:tab/>
           </w:r>
           <w:r>
-            <w:t>60</w:t>
+            <w:t>61</w:t>
           </w:r>
         </w:p>
         <w:p>
@@ -1563,7 +1563,7 @@
             <w:tab/>
           </w:r>
           <w:r>
-            <w:t>61</w:t>
+            <w:t>62</w:t>
           </w:r>
         </w:p>
         <w:p>
@@ -1581,7 +1581,7 @@
             <w:tab/>
           </w:r>
           <w:r>
-            <w:t>61</w:t>
+            <w:t>62</w:t>
           </w:r>
         </w:p>
         <w:p>
@@ -1599,7 +1599,7 @@
             <w:tab/>
           </w:r>
           <w:r>
-            <w:t>62</w:t>
+            <w:t>63</w:t>
           </w:r>
         </w:p>
         <w:p>
@@ -1617,7 +1617,7 @@
             <w:tab/>
           </w:r>
           <w:r>
-            <w:t>63</w:t>
+            <w:t>64</w:t>
           </w:r>
         </w:p>
         <w:p>
@@ -1635,7 +1635,7 @@
             <w:tab/>
           </w:r>
           <w:r>
-            <w:t>65</w:t>
+            <w:t>66</w:t>
           </w:r>
         </w:p>
         <w:p>
@@ -1653,7 +1653,7 @@
             <w:tab/>
           </w:r>
           <w:r>
-            <w:t>66</w:t>
+            <w:t>67</w:t>
           </w:r>
         </w:p>
         <w:p>
@@ -1671,7 +1671,7 @@
             <w:tab/>
           </w:r>
           <w:r>
-            <w:t>67</w:t>
+            <w:t>68</w:t>
           </w:r>
         </w:p>
         <w:p>
@@ -1689,7 +1689,7 @@
             <w:tab/>
           </w:r>
           <w:r>
-            <w:t>67</w:t>
+            <w:t>68</w:t>
           </w:r>
         </w:p>
         <w:p>
@@ -1707,7 +1707,7 @@
             <w:tab/>
           </w:r>
           <w:r>
-            <w:t>68</w:t>
+            <w:t>69</w:t>
           </w:r>
         </w:p>
         <w:p>
@@ -1725,7 +1725,7 @@
             <w:tab/>
           </w:r>
           <w:r>
-            <w:t>71</w:t>
+            <w:t>72</w:t>
           </w:r>
         </w:p>
         <w:p>
@@ -1743,7 +1743,7 @@
             <w:tab/>
           </w:r>
           <w:r>
-            <w:t>73</w:t>
+            <w:t>74</w:t>
           </w:r>
         </w:p>
         <w:p>
@@ -1761,7 +1761,7 @@
             <w:tab/>
           </w:r>
           <w:r>
-            <w:t>74</w:t>
+            <w:t>75</w:t>
           </w:r>
         </w:p>
         <w:p>
@@ -1779,7 +1779,7 @@
             <w:tab/>
           </w:r>
           <w:r>
-            <w:t>75</w:t>
+            <w:t>76</w:t>
           </w:r>
         </w:p>
         <w:p>
@@ -8675,7 +8675,7 @@
                 <w:sz w:val="24"/>
                 <w:szCs w:val="24"/>
               </w:rPr>
-              <w:t xml:space="preserve">Aceptado (revisado el 2026-10-25: particionador por zona)</w:t>
+              <w:t xml:space="preserve">Aceptado (revisado el 2026-10-26: particionador por zona y comparación con RabbitMQ Streams)</w:t>
             </w:r>
           </w:p>
         </w:tc>
@@ -9279,7 +9279,47 @@
                 <w:sz w:val="24"/>
                 <w:szCs w:val="24"/>
               </w:rPr>
-              <w:t xml:space="preserve">Colas: el mensaje se borra al consumirse (RabbitMQ Streams agrega un log persistente, pero sin grupos de consumidores con reparto automático de particiones)</w:t>
+              <w:t xml:space="preserve">Colas: el mensaje se borra al consumirse. Los </w:t>
+            </w:r>
+            <w:r>
+              <w:rPr>
+                <w:b w:val="false"/>
+                <w:bCs w:val="false"/>
+                <w:i/>
+                <w:iCs/>
+                <w:sz w:val="24"/>
+                <w:szCs w:val="24"/>
+              </w:rPr>
+              <w:t xml:space="preserve">streams</w:t>
+            </w:r>
+            <w:r>
+              <w:rPr>
+                <w:b w:val="false"/>
+                <w:bCs w:val="false"/>
+                <w:sz w:val="24"/>
+                <w:szCs w:val="24"/>
+              </w:rPr>
+              <w:t xml:space="preserve"> y </w:t>
+            </w:r>
+            <w:r>
+              <w:rPr>
+                <w:b w:val="false"/>
+                <w:bCs w:val="false"/>
+                <w:i/>
+                <w:iCs/>
+                <w:sz w:val="24"/>
+                <w:szCs w:val="24"/>
+              </w:rPr>
+              <w:t xml:space="preserve">super streams</w:t>
+            </w:r>
+            <w:r>
+              <w:rPr>
+                <w:b w:val="false"/>
+                <w:bCs w:val="false"/>
+                <w:sz w:val="24"/>
+                <w:szCs w:val="24"/>
+              </w:rPr>
+              <w:t xml:space="preserve"> (desde la versión 3.​11) agregan un log particionado con un consumidor activo por partición, pero son una función reciente al lado de su modelo de colas, con menos bibliotecas y herramientas que Kafka</w:t>
             </w:r>
           </w:p>
         </w:tc>
@@ -9573,7 +9613,27 @@
                 <w:sz w:val="24"/>
                 <w:szCs w:val="24"/>
               </w:rPr>
-              <w:t xml:space="preserve">No: el mensaje ya se borró</w:t>
+              <w:t xml:space="preserve">Con colas no: el mensaje ya se borró; con </w:t>
+            </w:r>
+            <w:r>
+              <w:rPr>
+                <w:b w:val="false"/>
+                <w:bCs w:val="false"/>
+                <w:i/>
+                <w:iCs/>
+                <w:sz w:val="24"/>
+                <w:szCs w:val="24"/>
+              </w:rPr>
+              <w:t xml:space="preserve">streams</w:t>
+            </w:r>
+            <w:r>
+              <w:rPr>
+                <w:b w:val="false"/>
+                <w:bCs w:val="false"/>
+                <w:sz w:val="24"/>
+                <w:szCs w:val="24"/>
+              </w:rPr>
+              <w:t xml:space="preserve"> sí</w:t>
             </w:r>
           </w:p>
         </w:tc>
@@ -9710,7 +9770,27 @@
                 <w:sz w:val="24"/>
                 <w:szCs w:val="24"/>
               </w:rPr>
-              <w:t xml:space="preserve">Por cola; se pierde con varios consumidores</w:t>
+              <w:t xml:space="preserve">Por cola; se pierde con varios consumidores compitiendo (los </w:t>
+            </w:r>
+            <w:r>
+              <w:rPr>
+                <w:b w:val="false"/>
+                <w:bCs w:val="false"/>
+                <w:i/>
+                <w:iCs/>
+                <w:sz w:val="24"/>
+                <w:szCs w:val="24"/>
+              </w:rPr>
+              <w:t xml:space="preserve">super streams</w:t>
+            </w:r>
+            <w:r>
+              <w:rPr>
+                <w:b w:val="false"/>
+                <w:bCs w:val="false"/>
+                <w:sz w:val="24"/>
+                <w:szCs w:val="24"/>
+              </w:rPr>
+              <w:t xml:space="preserve"> lo conservan por partición)</w:t>
             </w:r>
           </w:p>
         </w:tc>

</xml_diff>